<commit_message>
A-03: auto cz.III (kobiety 10 pkt, wielokrotne 10, suma) + cz.IV opis rozmowy; B-01: Kierownik CIS pod Realizatorem
</commit_message>
<xml_diff>
--- a/public/wzory/CIS_A-03_Karta_oceny_kandydata.docx
+++ b/public/wzory/CIS_A-03_Karta_oceny_kandydata.docx
@@ -1550,7 +1550,7 @@
                 <w:sz w:val="18"/>
                 <w:szCs w:val="18"/>
               </w:rPr>
-              <w:t xml:space="preserve"/>
+              <w:t>{{pkt_plec}}</w:t>
             </w:r>
           </w:p>
         </w:tc>
@@ -1654,7 +1654,7 @@
                 <w:sz w:val="18"/>
                 <w:szCs w:val="18"/>
               </w:rPr>
-              <w:t xml:space="preserve"/>
+              <w:t>{{pkt_wielokrotne}}</w:t>
             </w:r>
           </w:p>
         </w:tc>
@@ -2174,7 +2174,7 @@
                 <w:sz w:val="18"/>
                 <w:szCs w:val="18"/>
               </w:rPr>
-              <w:t xml:space="preserve"/>
+              <w:t>{{pkt_suma}}</w:t>
             </w:r>
           </w:p>
         </w:tc>
@@ -2262,7 +2262,7 @@
           <w:sz w:val="22"/>
           <w:szCs w:val="22"/>
         </w:rPr>
-        <w:t xml:space="preserve">………………………………………………………………………………………………………………………………………………………………………………………………………………………………………………</w:t>
+        <w:t>{{rozmowa_opis}}</w:t>
       </w:r>
     </w:p>
     <w:p>

</xml_diff>